<commit_message>
age setting of MI analysis changed to categorical
</commit_message>
<xml_diff>
--- a/output/tables/COAD/MI/COAD_MI_summary.docx
+++ b/output/tables/COAD/MI/COAD_MI_summary.docx
@@ -25,7 +25,7 @@
         <w:ind w:left="60" w:right="60" w:firstLine="0" w:firstLineChars="0"/>
       </w:pPr>
       <w:r>
-        <w:t xml:space="preserve">Overall survival by gene expression (High vs Low), TCGA-COAD: multivariable Cox regression adjusted for age (per 1 year), sex, pathologic stage group and pretreatment cea, complete-case vs multiple imputation. pretreatment cea missing in 157/430 patients was imputed by chained equations (m = 40, 20 iterations) using the other covariates, expression group, event status and the Nelson–Aalen cumulative hazard; estimates were pooled with Rubin's rules. FMI = fraction of missing information. Patients missing other covariates were excluded from both analyses.</w:t>
+        <w:t xml:space="preserve">Overall survival by gene expression (High vs Low), TCGA-COAD: multivariable Cox regression adjusted for age group, years, sex, pathologic stage group and pretreatment cea, complete-case vs multiple imputation. pretreatment cea missing in 157/430 patients was imputed by chained equations (m = 40, 20 iterations) using the other covariates, expression group, event status and the Nelson–Aalen cumulative hazard; estimates were pooled with Rubin's rules. FMI = fraction of missing information. Patients missing other covariates were excluded from both analyses.</w:t>
       </w:r>
     </w:p>
     <w:tbl xmlns:a="http://schemas.openxmlformats.org/drawingml/2006/main" xmlns:pic="http://schemas.openxmlformats.org/drawingml/2006/picture">
@@ -1157,7 +1157,7 @@
                 <w:szCs w:val="14"/>
                 <w:color w:val="000000"/>
               </w:rPr>
-              <w:t xml:space="preserve">0.46 (0.25–0.84)</w:t>
+              <w:t xml:space="preserve">0.45 (0.25–0.82)</w:t>
             </w:r>
           </w:p>
         </w:tc>
@@ -1212,7 +1212,7 @@
                 <w:szCs w:val="14"/>
                 <w:color w:val="000000"/>
               </w:rPr>
-              <w:t xml:space="preserve">0.011</w:t>
+              <w:t xml:space="preserve">0.009</w:t>
             </w:r>
           </w:p>
         </w:tc>
@@ -1432,7 +1432,7 @@
                 <w:szCs w:val="14"/>
                 <w:color w:val="000000"/>
               </w:rPr>
-              <w:t xml:space="preserve">0.64 (0.41–0.98)</w:t>
+              <w:t xml:space="preserve">0.65 (0.42–1.00)</w:t>
             </w:r>
           </w:p>
         </w:tc>
@@ -1487,7 +1487,7 @@
                 <w:szCs w:val="14"/>
                 <w:color w:val="000000"/>
               </w:rPr>
-              <w:t xml:space="preserve">0.042</w:t>
+              <w:t xml:space="preserve">0.051</w:t>
             </w:r>
           </w:p>
         </w:tc>
@@ -1542,7 +1542,7 @@
                 <w:szCs w:val="14"/>
                 <w:color w:val="000000"/>
               </w:rPr>
-              <w:t xml:space="preserve">0.055</w:t>
+              <w:t xml:space="preserve">0.052</w:t>
             </w:r>
           </w:p>
         </w:tc>
@@ -1987,7 +1987,7 @@
                 <w:szCs w:val="14"/>
                 <w:color w:val="000000"/>
               </w:rPr>
-              <w:t xml:space="preserve">1.13 (0.64–1.99)</w:t>
+              <w:t xml:space="preserve">1.19 (0.68–2.11)</w:t>
             </w:r>
           </w:p>
         </w:tc>
@@ -2042,7 +2042,7 @@
                 <w:szCs w:val="14"/>
                 <w:color w:val="000000"/>
               </w:rPr>
-              <w:t xml:space="preserve">0.675</w:t>
+              <w:t xml:space="preserve">0.543</w:t>
             </w:r>
           </w:p>
         </w:tc>
@@ -2262,7 +2262,7 @@
                 <w:szCs w:val="14"/>
                 <w:color w:val="000000"/>
               </w:rPr>
-              <w:t xml:space="preserve">0.83 (0.54–1.27)</w:t>
+              <w:t xml:space="preserve">0.84 (0.55–1.29)</w:t>
             </w:r>
           </w:p>
         </w:tc>
@@ -2317,7 +2317,7 @@
                 <w:szCs w:val="14"/>
                 <w:color w:val="000000"/>
               </w:rPr>
-              <w:t xml:space="preserve">0.388</w:t>
+              <w:t xml:space="preserve">0.423</w:t>
             </w:r>
           </w:p>
         </w:tc>
@@ -2372,7 +2372,7 @@
                 <w:szCs w:val="14"/>
                 <w:color w:val="000000"/>
               </w:rPr>
-              <w:t xml:space="preserve">0.063</w:t>
+              <w:t xml:space="preserve">0.052</w:t>
             </w:r>
           </w:p>
         </w:tc>
@@ -2817,7 +2817,7 @@
                 <w:szCs w:val="14"/>
                 <w:color w:val="000000"/>
               </w:rPr>
-              <w:t xml:space="preserve">1.66 (0.91–3.03)</w:t>
+              <w:t xml:space="preserve">1.52 (0.83–2.78)</w:t>
             </w:r>
           </w:p>
         </w:tc>
@@ -2872,7 +2872,7 @@
                 <w:szCs w:val="14"/>
                 <w:color w:val="000000"/>
               </w:rPr>
-              <w:t xml:space="preserve">0.098</w:t>
+              <w:t xml:space="preserve">0.176</w:t>
             </w:r>
           </w:p>
         </w:tc>
@@ -3092,7 +3092,7 @@
                 <w:szCs w:val="14"/>
                 <w:color w:val="000000"/>
               </w:rPr>
-              <w:t xml:space="preserve">1.14 (0.74–1.75)</w:t>
+              <w:t xml:space="preserve">1.12 (0.73–1.73)</w:t>
             </w:r>
           </w:p>
         </w:tc>
@@ -3147,7 +3147,7 @@
                 <w:szCs w:val="14"/>
                 <w:color w:val="000000"/>
               </w:rPr>
-              <w:t xml:space="preserve">0.542</w:t>
+              <w:t xml:space="preserve">0.592</w:t>
             </w:r>
           </w:p>
         </w:tc>
@@ -3202,7 +3202,7 @@
                 <w:szCs w:val="14"/>
                 <w:color w:val="000000"/>
               </w:rPr>
-              <w:t xml:space="preserve">0.068</w:t>
+              <w:t xml:space="preserve">0.071</w:t>
             </w:r>
           </w:p>
         </w:tc>
@@ -3922,7 +3922,7 @@
                 <w:szCs w:val="14"/>
                 <w:color w:val="000000"/>
               </w:rPr>
-              <w:t xml:space="preserve">0.72 (0.47–1.11)</w:t>
+              <w:t xml:space="preserve">0.71 (0.47–1.09)</w:t>
             </w:r>
           </w:p>
         </w:tc>
@@ -3977,7 +3977,7 @@
                 <w:szCs w:val="14"/>
                 <w:color w:val="000000"/>
               </w:rPr>
-              <w:t xml:space="preserve">0.136</w:t>
+              <w:t xml:space="preserve">0.121</w:t>
             </w:r>
           </w:p>
         </w:tc>
@@ -4032,7 +4032,7 @@
                 <w:szCs w:val="14"/>
                 <w:color w:val="000000"/>
               </w:rPr>
-              <w:t xml:space="preserve">0.065</w:t>
+              <w:t xml:space="preserve">0.058</w:t>
             </w:r>
           </w:p>
         </w:tc>
@@ -4477,7 +4477,7 @@
                 <w:szCs w:val="14"/>
                 <w:color w:val="000000"/>
               </w:rPr>
-              <w:t xml:space="preserve">1.19 (0.67–2.10)</w:t>
+              <w:t xml:space="preserve">1.14 (0.64–2.01)</w:t>
             </w:r>
           </w:p>
         </w:tc>
@@ -4532,7 +4532,7 @@
                 <w:szCs w:val="14"/>
                 <w:color w:val="000000"/>
               </w:rPr>
-              <w:t xml:space="preserve">0.549</w:t>
+              <w:t xml:space="preserve">0.662</w:t>
             </w:r>
           </w:p>
         </w:tc>
@@ -4752,7 +4752,7 @@
                 <w:szCs w:val="14"/>
                 <w:color w:val="000000"/>
               </w:rPr>
-              <w:t xml:space="preserve">0.95 (0.62–1.45)</w:t>
+              <w:t xml:space="preserve">0.96 (0.63–1.47)</w:t>
             </w:r>
           </w:p>
         </w:tc>
@@ -4807,7 +4807,7 @@
                 <w:szCs w:val="14"/>
                 <w:color w:val="000000"/>
               </w:rPr>
-              <w:t xml:space="preserve">0.807</w:t>
+              <w:t xml:space="preserve">0.864</w:t>
             </w:r>
           </w:p>
         </w:tc>
@@ -5307,7 +5307,7 @@
                 <w:szCs w:val="14"/>
                 <w:color w:val="000000"/>
               </w:rPr>
-              <w:t xml:space="preserve">1.31 (0.74–2.33)</w:t>
+              <w:t xml:space="preserve">1.34 (0.75–2.38)</w:t>
             </w:r>
           </w:p>
         </w:tc>
@@ -5362,7 +5362,7 @@
                 <w:szCs w:val="14"/>
                 <w:color w:val="000000"/>
               </w:rPr>
-              <w:t xml:space="preserve">0.360</w:t>
+              <w:t xml:space="preserve">0.325</w:t>
             </w:r>
           </w:p>
         </w:tc>
@@ -5582,7 +5582,7 @@
                 <w:szCs w:val="14"/>
                 <w:color w:val="000000"/>
               </w:rPr>
-              <w:t xml:space="preserve">1.05 (0.69–1.61)</w:t>
+              <w:t xml:space="preserve">1.10 (0.72–1.67)</w:t>
             </w:r>
           </w:p>
         </w:tc>
@@ -5637,7 +5637,7 @@
                 <w:szCs w:val="14"/>
                 <w:color w:val="000000"/>
               </w:rPr>
-              <w:t xml:space="preserve">0.815</w:t>
+              <w:t xml:space="preserve">0.670</w:t>
             </w:r>
           </w:p>
         </w:tc>
@@ -5692,7 +5692,7 @@
                 <w:szCs w:val="14"/>
                 <w:color w:val="000000"/>
               </w:rPr>
-              <w:t xml:space="preserve">0.060</w:t>
+              <w:t xml:space="preserve">0.051</w:t>
             </w:r>
           </w:p>
         </w:tc>
@@ -6137,7 +6137,7 @@
                 <w:szCs w:val="14"/>
                 <w:color w:val="000000"/>
               </w:rPr>
-              <w:t xml:space="preserve">2.18 (1.20–3.95)</w:t>
+              <w:t xml:space="preserve">2.16 (1.19–3.92)</w:t>
             </w:r>
           </w:p>
         </w:tc>
@@ -6192,6 +6192,281 @@
                 <w:szCs w:val="14"/>
                 <w:color w:val="000000"/>
               </w:rPr>
+              <w:t xml:space="preserve">0.012</w:t>
+            </w:r>
+          </w:p>
+        </w:tc>
+        <w:tc>
+          <w:tcPr>
+            <w:tcBorders>
+              <w:bottom w:val="none" w:sz="0" w:space="0" w:color="000000"/>
+              <w:top w:val="none" w:sz="0" w:space="0" w:color="000000"/>
+              <w:left w:val="none" w:sz="0" w:space="0" w:color="000000"/>
+              <w:right w:val="none" w:sz="0" w:space="0" w:color="000000"/>
+            </w:tcBorders>
+            <w:shd w:val="clear" w:color="auto" w:fill="FFFFFF"/>
+            <w:tcMar>
+              <w:top w:w="0" w:type="dxa"/>
+              <w:bottom w:w="0" w:type="dxa"/>
+              <w:left w:w="0" w:type="dxa"/>
+              <w:right w:w="0" w:type="dxa"/>
+            </w:tcMar>
+            <w:vAlign w:val="center"/>
+          </w:tcPr>
+          <w:p>
+            <w:pPr>
+              <w:pStyle w:val="Normal"/>
+              <w:jc w:val="right"/>
+              <w:pBdr>
+                <w:bottom w:val="none" w:sz="0" w:space="0" w:color="000000"/>
+                <w:top w:val="none" w:sz="0" w:space="0" w:color="000000"/>
+                <w:left w:val="none" w:sz="0" w:space="0" w:color="000000"/>
+                <w:right w:val="none" w:sz="0" w:space="0" w:color="000000"/>
+              </w:pBdr>
+              <w:spacing w:after="100" w:before="100" w:line="240"/>
+              <w:ind w:left="100" w:right="100" w:firstLine="0" w:firstLineChars="0"/>
+              <w:rPr>
+                <w:rFonts w:ascii="Times New Roman" w:hAnsi="Times New Roman" w:eastAsia="Times New Roman" w:cs="Times New Roman"/>
+                <w:i w:val="false"/>
+                <w:b w:val="false"/>
+                <w:u w:val="none"/>
+                <w:strike w:val="false"/>
+                <w:sz w:val="14"/>
+                <w:szCs w:val="14"/>
+                <w:color w:val="000000"/>
+              </w:rPr>
+            </w:pPr>
+            <w:r>
+              <w:rPr>
+                <w:rFonts w:ascii="Times New Roman" w:hAnsi="Times New Roman" w:eastAsia="Times New Roman" w:cs="Times New Roman"/>
+                <w:i w:val="false"/>
+                <w:b w:val="false"/>
+                <w:u w:val="none"/>
+                <w:strike w:val="false"/>
+                <w:sz w:val="14"/>
+                <w:szCs w:val="14"/>
+                <w:color w:val="000000"/>
+              </w:rPr>
+              <w:t xml:space="preserve">430</w:t>
+            </w:r>
+          </w:p>
+        </w:tc>
+        <w:tc>
+          <w:tcPr>
+            <w:tcBorders>
+              <w:bottom w:val="none" w:sz="0" w:space="0" w:color="000000"/>
+              <w:top w:val="none" w:sz="0" w:space="0" w:color="000000"/>
+              <w:left w:val="none" w:sz="0" w:space="0" w:color="000000"/>
+              <w:right w:val="none" w:sz="0" w:space="0" w:color="000000"/>
+            </w:tcBorders>
+            <w:shd w:val="clear" w:color="auto" w:fill="FFFFFF"/>
+            <w:tcMar>
+              <w:top w:w="0" w:type="dxa"/>
+              <w:bottom w:w="0" w:type="dxa"/>
+              <w:left w:w="0" w:type="dxa"/>
+              <w:right w:w="0" w:type="dxa"/>
+            </w:tcMar>
+            <w:vAlign w:val="center"/>
+          </w:tcPr>
+          <w:p>
+            <w:pPr>
+              <w:pStyle w:val="Normal"/>
+              <w:jc w:val="right"/>
+              <w:pBdr>
+                <w:bottom w:val="none" w:sz="0" w:space="0" w:color="000000"/>
+                <w:top w:val="none" w:sz="0" w:space="0" w:color="000000"/>
+                <w:left w:val="none" w:sz="0" w:space="0" w:color="000000"/>
+                <w:right w:val="none" w:sz="0" w:space="0" w:color="000000"/>
+              </w:pBdr>
+              <w:spacing w:after="100" w:before="100" w:line="240"/>
+              <w:ind w:left="100" w:right="100" w:firstLine="0" w:firstLineChars="0"/>
+              <w:rPr>
+                <w:rFonts w:ascii="Times New Roman" w:hAnsi="Times New Roman" w:eastAsia="Times New Roman" w:cs="Times New Roman"/>
+                <w:i w:val="false"/>
+                <w:b w:val="false"/>
+                <w:u w:val="none"/>
+                <w:strike w:val="false"/>
+                <w:sz w:val="14"/>
+                <w:szCs w:val="14"/>
+                <w:color w:val="000000"/>
+              </w:rPr>
+            </w:pPr>
+            <w:r>
+              <w:rPr>
+                <w:rFonts w:ascii="Times New Roman" w:hAnsi="Times New Roman" w:eastAsia="Times New Roman" w:cs="Times New Roman"/>
+                <w:i w:val="false"/>
+                <w:b w:val="false"/>
+                <w:u w:val="none"/>
+                <w:strike w:val="false"/>
+                <w:sz w:val="14"/>
+                <w:szCs w:val="14"/>
+                <w:color w:val="000000"/>
+              </w:rPr>
+              <w:t xml:space="preserve">93</w:t>
+            </w:r>
+          </w:p>
+        </w:tc>
+        <w:tc>
+          <w:tcPr>
+            <w:tcBorders>
+              <w:bottom w:val="none" w:sz="0" w:space="0" w:color="000000"/>
+              <w:top w:val="none" w:sz="0" w:space="0" w:color="000000"/>
+              <w:left w:val="none" w:sz="0" w:space="0" w:color="000000"/>
+              <w:right w:val="none" w:sz="0" w:space="0" w:color="000000"/>
+            </w:tcBorders>
+            <w:shd w:val="clear" w:color="auto" w:fill="FFFFFF"/>
+            <w:tcMar>
+              <w:top w:w="0" w:type="dxa"/>
+              <w:bottom w:w="0" w:type="dxa"/>
+              <w:left w:w="0" w:type="dxa"/>
+              <w:right w:w="0" w:type="dxa"/>
+            </w:tcMar>
+            <w:vAlign w:val="center"/>
+          </w:tcPr>
+          <w:p>
+            <w:pPr>
+              <w:pStyle w:val="Normal"/>
+              <w:jc w:val="left"/>
+              <w:pBdr>
+                <w:bottom w:val="none" w:sz="0" w:space="0" w:color="000000"/>
+                <w:top w:val="none" w:sz="0" w:space="0" w:color="000000"/>
+                <w:left w:val="none" w:sz="0" w:space="0" w:color="000000"/>
+                <w:right w:val="none" w:sz="0" w:space="0" w:color="000000"/>
+              </w:pBdr>
+              <w:spacing w:after="100" w:before="100" w:line="240"/>
+              <w:ind w:left="100" w:right="100" w:firstLine="0" w:firstLineChars="0"/>
+              <w:rPr>
+                <w:rFonts w:ascii="Times New Roman" w:hAnsi="Times New Roman" w:eastAsia="Times New Roman" w:cs="Times New Roman"/>
+                <w:i w:val="false"/>
+                <w:b w:val="false"/>
+                <w:u w:val="none"/>
+                <w:strike w:val="false"/>
+                <w:sz w:val="14"/>
+                <w:szCs w:val="14"/>
+                <w:color w:val="000000"/>
+              </w:rPr>
+            </w:pPr>
+            <w:r>
+              <w:rPr>
+                <w:rFonts w:ascii="Times New Roman" w:hAnsi="Times New Roman" w:eastAsia="Times New Roman" w:cs="Times New Roman"/>
+                <w:i w:val="false"/>
+                <w:b w:val="false"/>
+                <w:u w:val="none"/>
+                <w:strike w:val="false"/>
+                <w:sz w:val="14"/>
+                <w:szCs w:val="14"/>
+                <w:color w:val="000000"/>
+              </w:rPr>
+              <w:t xml:space="preserve">157 (36.5%)</w:t>
+            </w:r>
+          </w:p>
+        </w:tc>
+        <w:tc>
+          <w:tcPr>
+            <w:tcBorders>
+              <w:bottom w:val="none" w:sz="0" w:space="0" w:color="000000"/>
+              <w:top w:val="none" w:sz="0" w:space="0" w:color="000000"/>
+              <w:left w:val="none" w:sz="0" w:space="0" w:color="000000"/>
+              <w:right w:val="none" w:sz="0" w:space="0" w:color="000000"/>
+            </w:tcBorders>
+            <w:shd w:val="clear" w:color="auto" w:fill="FFFFFF"/>
+            <w:tcMar>
+              <w:top w:w="0" w:type="dxa"/>
+              <w:bottom w:w="0" w:type="dxa"/>
+              <w:left w:w="0" w:type="dxa"/>
+              <w:right w:w="0" w:type="dxa"/>
+            </w:tcMar>
+            <w:vAlign w:val="center"/>
+          </w:tcPr>
+          <w:p>
+            <w:pPr>
+              <w:pStyle w:val="Normal"/>
+              <w:jc w:val="left"/>
+              <w:pBdr>
+                <w:bottom w:val="none" w:sz="0" w:space="0" w:color="000000"/>
+                <w:top w:val="none" w:sz="0" w:space="0" w:color="000000"/>
+                <w:left w:val="none" w:sz="0" w:space="0" w:color="000000"/>
+                <w:right w:val="none" w:sz="0" w:space="0" w:color="000000"/>
+              </w:pBdr>
+              <w:spacing w:after="100" w:before="100" w:line="240"/>
+              <w:ind w:left="100" w:right="100" w:firstLine="0" w:firstLineChars="0"/>
+              <w:rPr>
+                <w:rFonts w:ascii="Times New Roman" w:hAnsi="Times New Roman" w:eastAsia="Times New Roman" w:cs="Times New Roman"/>
+                <w:i w:val="false"/>
+                <w:b w:val="false"/>
+                <w:u w:val="none"/>
+                <w:strike w:val="false"/>
+                <w:sz w:val="14"/>
+                <w:szCs w:val="14"/>
+                <w:color w:val="000000"/>
+              </w:rPr>
+            </w:pPr>
+            <w:r>
+              <w:rPr>
+                <w:rFonts w:ascii="Times New Roman" w:hAnsi="Times New Roman" w:eastAsia="Times New Roman" w:cs="Times New Roman"/>
+                <w:i w:val="false"/>
+                <w:b w:val="false"/>
+                <w:u w:val="none"/>
+                <w:strike w:val="false"/>
+                <w:sz w:val="14"/>
+                <w:szCs w:val="14"/>
+                <w:color w:val="000000"/>
+              </w:rPr>
+              <w:t xml:space="preserve">1.77 (1.14–2.74)</w:t>
+            </w:r>
+          </w:p>
+        </w:tc>
+        <w:tc>
+          <w:tcPr>
+            <w:tcBorders>
+              <w:bottom w:val="none" w:sz="0" w:space="0" w:color="000000"/>
+              <w:top w:val="none" w:sz="0" w:space="0" w:color="000000"/>
+              <w:left w:val="none" w:sz="0" w:space="0" w:color="000000"/>
+              <w:right w:val="none" w:sz="0" w:space="0" w:color="000000"/>
+            </w:tcBorders>
+            <w:shd w:val="clear" w:color="auto" w:fill="FFFFFF"/>
+            <w:tcMar>
+              <w:top w:w="0" w:type="dxa"/>
+              <w:bottom w:w="0" w:type="dxa"/>
+              <w:left w:w="0" w:type="dxa"/>
+              <w:right w:w="0" w:type="dxa"/>
+            </w:tcMar>
+            <w:vAlign w:val="center"/>
+          </w:tcPr>
+          <w:p>
+            <w:pPr>
+              <w:pStyle w:val="Normal"/>
+              <w:jc w:val="left"/>
+              <w:pBdr>
+                <w:bottom w:val="none" w:sz="0" w:space="0" w:color="000000"/>
+                <w:top w:val="none" w:sz="0" w:space="0" w:color="000000"/>
+                <w:left w:val="none" w:sz="0" w:space="0" w:color="000000"/>
+                <w:right w:val="none" w:sz="0" w:space="0" w:color="000000"/>
+              </w:pBdr>
+              <w:spacing w:after="100" w:before="100" w:line="240"/>
+              <w:ind w:left="100" w:right="100" w:firstLine="0" w:firstLineChars="0"/>
+              <w:rPr>
+                <w:rFonts w:ascii="Times New Roman" w:hAnsi="Times New Roman" w:eastAsia="Times New Roman" w:cs="Times New Roman"/>
+                <w:i w:val="false"/>
+                <w:b w:val="false"/>
+                <w:u w:val="none"/>
+                <w:strike w:val="false"/>
+                <w:sz w:val="14"/>
+                <w:szCs w:val="14"/>
+                <w:color w:val="000000"/>
+              </w:rPr>
+            </w:pPr>
+            <w:r>
+              <w:rPr>
+                <w:rFonts w:ascii="Times New Roman" w:hAnsi="Times New Roman" w:eastAsia="Times New Roman" w:cs="Times New Roman"/>
+                <w:i w:val="false"/>
+                <w:b w:val="false"/>
+                <w:u w:val="none"/>
+                <w:strike w:val="false"/>
+                <w:sz w:val="14"/>
+                <w:szCs w:val="14"/>
+                <w:color w:val="000000"/>
+              </w:rPr>
               <w:t xml:space="preserve">0.011</w:t>
             </w:r>
           </w:p>
@@ -6216,116 +6491,6 @@
           <w:p>
             <w:pPr>
               <w:pStyle w:val="Normal"/>
-              <w:jc w:val="right"/>
-              <w:pBdr>
-                <w:bottom w:val="none" w:sz="0" w:space="0" w:color="000000"/>
-                <w:top w:val="none" w:sz="0" w:space="0" w:color="000000"/>
-                <w:left w:val="none" w:sz="0" w:space="0" w:color="000000"/>
-                <w:right w:val="none" w:sz="0" w:space="0" w:color="000000"/>
-              </w:pBdr>
-              <w:spacing w:after="100" w:before="100" w:line="240"/>
-              <w:ind w:left="100" w:right="100" w:firstLine="0" w:firstLineChars="0"/>
-              <w:rPr>
-                <w:rFonts w:ascii="Times New Roman" w:hAnsi="Times New Roman" w:eastAsia="Times New Roman" w:cs="Times New Roman"/>
-                <w:i w:val="false"/>
-                <w:b w:val="false"/>
-                <w:u w:val="none"/>
-                <w:strike w:val="false"/>
-                <w:sz w:val="14"/>
-                <w:szCs w:val="14"/>
-                <w:color w:val="000000"/>
-              </w:rPr>
-            </w:pPr>
-            <w:r>
-              <w:rPr>
-                <w:rFonts w:ascii="Times New Roman" w:hAnsi="Times New Roman" w:eastAsia="Times New Roman" w:cs="Times New Roman"/>
-                <w:i w:val="false"/>
-                <w:b w:val="false"/>
-                <w:u w:val="none"/>
-                <w:strike w:val="false"/>
-                <w:sz w:val="14"/>
-                <w:szCs w:val="14"/>
-                <w:color w:val="000000"/>
-              </w:rPr>
-              <w:t xml:space="preserve">430</w:t>
-            </w:r>
-          </w:p>
-        </w:tc>
-        <w:tc>
-          <w:tcPr>
-            <w:tcBorders>
-              <w:bottom w:val="none" w:sz="0" w:space="0" w:color="000000"/>
-              <w:top w:val="none" w:sz="0" w:space="0" w:color="000000"/>
-              <w:left w:val="none" w:sz="0" w:space="0" w:color="000000"/>
-              <w:right w:val="none" w:sz="0" w:space="0" w:color="000000"/>
-            </w:tcBorders>
-            <w:shd w:val="clear" w:color="auto" w:fill="FFFFFF"/>
-            <w:tcMar>
-              <w:top w:w="0" w:type="dxa"/>
-              <w:bottom w:w="0" w:type="dxa"/>
-              <w:left w:w="0" w:type="dxa"/>
-              <w:right w:w="0" w:type="dxa"/>
-            </w:tcMar>
-            <w:vAlign w:val="center"/>
-          </w:tcPr>
-          <w:p>
-            <w:pPr>
-              <w:pStyle w:val="Normal"/>
-              <w:jc w:val="right"/>
-              <w:pBdr>
-                <w:bottom w:val="none" w:sz="0" w:space="0" w:color="000000"/>
-                <w:top w:val="none" w:sz="0" w:space="0" w:color="000000"/>
-                <w:left w:val="none" w:sz="0" w:space="0" w:color="000000"/>
-                <w:right w:val="none" w:sz="0" w:space="0" w:color="000000"/>
-              </w:pBdr>
-              <w:spacing w:after="100" w:before="100" w:line="240"/>
-              <w:ind w:left="100" w:right="100" w:firstLine="0" w:firstLineChars="0"/>
-              <w:rPr>
-                <w:rFonts w:ascii="Times New Roman" w:hAnsi="Times New Roman" w:eastAsia="Times New Roman" w:cs="Times New Roman"/>
-                <w:i w:val="false"/>
-                <w:b w:val="false"/>
-                <w:u w:val="none"/>
-                <w:strike w:val="false"/>
-                <w:sz w:val="14"/>
-                <w:szCs w:val="14"/>
-                <w:color w:val="000000"/>
-              </w:rPr>
-            </w:pPr>
-            <w:r>
-              <w:rPr>
-                <w:rFonts w:ascii="Times New Roman" w:hAnsi="Times New Roman" w:eastAsia="Times New Roman" w:cs="Times New Roman"/>
-                <w:i w:val="false"/>
-                <w:b w:val="false"/>
-                <w:u w:val="none"/>
-                <w:strike w:val="false"/>
-                <w:sz w:val="14"/>
-                <w:szCs w:val="14"/>
-                <w:color w:val="000000"/>
-              </w:rPr>
-              <w:t xml:space="preserve">93</w:t>
-            </w:r>
-          </w:p>
-        </w:tc>
-        <w:tc>
-          <w:tcPr>
-            <w:tcBorders>
-              <w:bottom w:val="none" w:sz="0" w:space="0" w:color="000000"/>
-              <w:top w:val="none" w:sz="0" w:space="0" w:color="000000"/>
-              <w:left w:val="none" w:sz="0" w:space="0" w:color="000000"/>
-              <w:right w:val="none" w:sz="0" w:space="0" w:color="000000"/>
-            </w:tcBorders>
-            <w:shd w:val="clear" w:color="auto" w:fill="FFFFFF"/>
-            <w:tcMar>
-              <w:top w:w="0" w:type="dxa"/>
-              <w:bottom w:w="0" w:type="dxa"/>
-              <w:left w:w="0" w:type="dxa"/>
-              <w:right w:w="0" w:type="dxa"/>
-            </w:tcMar>
-            <w:vAlign w:val="center"/>
-          </w:tcPr>
-          <w:p>
-            <w:pPr>
-              <w:pStyle w:val="Normal"/>
               <w:jc w:val="left"/>
               <w:pBdr>
                 <w:bottom w:val="none" w:sz="0" w:space="0" w:color="000000"/>
@@ -6357,172 +6522,7 @@
                 <w:szCs w:val="14"/>
                 <w:color w:val="000000"/>
               </w:rPr>
-              <w:t xml:space="preserve">157 (36.5%)</w:t>
-            </w:r>
-          </w:p>
-        </w:tc>
-        <w:tc>
-          <w:tcPr>
-            <w:tcBorders>
-              <w:bottom w:val="none" w:sz="0" w:space="0" w:color="000000"/>
-              <w:top w:val="none" w:sz="0" w:space="0" w:color="000000"/>
-              <w:left w:val="none" w:sz="0" w:space="0" w:color="000000"/>
-              <w:right w:val="none" w:sz="0" w:space="0" w:color="000000"/>
-            </w:tcBorders>
-            <w:shd w:val="clear" w:color="auto" w:fill="FFFFFF"/>
-            <w:tcMar>
-              <w:top w:w="0" w:type="dxa"/>
-              <w:bottom w:w="0" w:type="dxa"/>
-              <w:left w:w="0" w:type="dxa"/>
-              <w:right w:w="0" w:type="dxa"/>
-            </w:tcMar>
-            <w:vAlign w:val="center"/>
-          </w:tcPr>
-          <w:p>
-            <w:pPr>
-              <w:pStyle w:val="Normal"/>
-              <w:jc w:val="left"/>
-              <w:pBdr>
-                <w:bottom w:val="none" w:sz="0" w:space="0" w:color="000000"/>
-                <w:top w:val="none" w:sz="0" w:space="0" w:color="000000"/>
-                <w:left w:val="none" w:sz="0" w:space="0" w:color="000000"/>
-                <w:right w:val="none" w:sz="0" w:space="0" w:color="000000"/>
-              </w:pBdr>
-              <w:spacing w:after="100" w:before="100" w:line="240"/>
-              <w:ind w:left="100" w:right="100" w:firstLine="0" w:firstLineChars="0"/>
-              <w:rPr>
-                <w:rFonts w:ascii="Times New Roman" w:hAnsi="Times New Roman" w:eastAsia="Times New Roman" w:cs="Times New Roman"/>
-                <w:i w:val="false"/>
-                <w:b w:val="false"/>
-                <w:u w:val="none"/>
-                <w:strike w:val="false"/>
-                <w:sz w:val="14"/>
-                <w:szCs w:val="14"/>
-                <w:color w:val="000000"/>
-              </w:rPr>
-            </w:pPr>
-            <w:r>
-              <w:rPr>
-                <w:rFonts w:ascii="Times New Roman" w:hAnsi="Times New Roman" w:eastAsia="Times New Roman" w:cs="Times New Roman"/>
-                <w:i w:val="false"/>
-                <w:b w:val="false"/>
-                <w:u w:val="none"/>
-                <w:strike w:val="false"/>
-                <w:sz w:val="14"/>
-                <w:szCs w:val="14"/>
-                <w:color w:val="000000"/>
-              </w:rPr>
-              <w:t xml:space="preserve">1.78 (1.15–2.76)</w:t>
-            </w:r>
-          </w:p>
-        </w:tc>
-        <w:tc>
-          <w:tcPr>
-            <w:tcBorders>
-              <w:bottom w:val="none" w:sz="0" w:space="0" w:color="000000"/>
-              <w:top w:val="none" w:sz="0" w:space="0" w:color="000000"/>
-              <w:left w:val="none" w:sz="0" w:space="0" w:color="000000"/>
-              <w:right w:val="none" w:sz="0" w:space="0" w:color="000000"/>
-            </w:tcBorders>
-            <w:shd w:val="clear" w:color="auto" w:fill="FFFFFF"/>
-            <w:tcMar>
-              <w:top w:w="0" w:type="dxa"/>
-              <w:bottom w:w="0" w:type="dxa"/>
-              <w:left w:w="0" w:type="dxa"/>
-              <w:right w:w="0" w:type="dxa"/>
-            </w:tcMar>
-            <w:vAlign w:val="center"/>
-          </w:tcPr>
-          <w:p>
-            <w:pPr>
-              <w:pStyle w:val="Normal"/>
-              <w:jc w:val="left"/>
-              <w:pBdr>
-                <w:bottom w:val="none" w:sz="0" w:space="0" w:color="000000"/>
-                <w:top w:val="none" w:sz="0" w:space="0" w:color="000000"/>
-                <w:left w:val="none" w:sz="0" w:space="0" w:color="000000"/>
-                <w:right w:val="none" w:sz="0" w:space="0" w:color="000000"/>
-              </w:pBdr>
-              <w:spacing w:after="100" w:before="100" w:line="240"/>
-              <w:ind w:left="100" w:right="100" w:firstLine="0" w:firstLineChars="0"/>
-              <w:rPr>
-                <w:rFonts w:ascii="Times New Roman" w:hAnsi="Times New Roman" w:eastAsia="Times New Roman" w:cs="Times New Roman"/>
-                <w:i w:val="false"/>
-                <w:b w:val="false"/>
-                <w:u w:val="none"/>
-                <w:strike w:val="false"/>
-                <w:sz w:val="14"/>
-                <w:szCs w:val="14"/>
-                <w:color w:val="000000"/>
-              </w:rPr>
-            </w:pPr>
-            <w:r>
-              <w:rPr>
-                <w:rFonts w:ascii="Times New Roman" w:hAnsi="Times New Roman" w:eastAsia="Times New Roman" w:cs="Times New Roman"/>
-                <w:i w:val="false"/>
-                <w:b w:val="false"/>
-                <w:u w:val="none"/>
-                <w:strike w:val="false"/>
-                <w:sz w:val="14"/>
-                <w:szCs w:val="14"/>
-                <w:color w:val="000000"/>
-              </w:rPr>
-              <w:t xml:space="preserve">0.010</w:t>
-            </w:r>
-          </w:p>
-        </w:tc>
-        <w:tc>
-          <w:tcPr>
-            <w:tcBorders>
-              <w:bottom w:val="none" w:sz="0" w:space="0" w:color="000000"/>
-              <w:top w:val="none" w:sz="0" w:space="0" w:color="000000"/>
-              <w:left w:val="none" w:sz="0" w:space="0" w:color="000000"/>
-              <w:right w:val="none" w:sz="0" w:space="0" w:color="000000"/>
-            </w:tcBorders>
-            <w:shd w:val="clear" w:color="auto" w:fill="FFFFFF"/>
-            <w:tcMar>
-              <w:top w:w="0" w:type="dxa"/>
-              <w:bottom w:w="0" w:type="dxa"/>
-              <w:left w:w="0" w:type="dxa"/>
-              <w:right w:w="0" w:type="dxa"/>
-            </w:tcMar>
-            <w:vAlign w:val="center"/>
-          </w:tcPr>
-          <w:p>
-            <w:pPr>
-              <w:pStyle w:val="Normal"/>
-              <w:jc w:val="left"/>
-              <w:pBdr>
-                <w:bottom w:val="none" w:sz="0" w:space="0" w:color="000000"/>
-                <w:top w:val="none" w:sz="0" w:space="0" w:color="000000"/>
-                <w:left w:val="none" w:sz="0" w:space="0" w:color="000000"/>
-                <w:right w:val="none" w:sz="0" w:space="0" w:color="000000"/>
-              </w:pBdr>
-              <w:spacing w:after="100" w:before="100" w:line="240"/>
-              <w:ind w:left="100" w:right="100" w:firstLine="0" w:firstLineChars="0"/>
-              <w:rPr>
-                <w:rFonts w:ascii="Times New Roman" w:hAnsi="Times New Roman" w:eastAsia="Times New Roman" w:cs="Times New Roman"/>
-                <w:i w:val="false"/>
-                <w:b w:val="false"/>
-                <w:u w:val="none"/>
-                <w:strike w:val="false"/>
-                <w:sz w:val="14"/>
-                <w:szCs w:val="14"/>
-                <w:color w:val="000000"/>
-              </w:rPr>
-            </w:pPr>
-            <w:r>
-              <w:rPr>
-                <w:rFonts w:ascii="Times New Roman" w:hAnsi="Times New Roman" w:eastAsia="Times New Roman" w:cs="Times New Roman"/>
-                <w:i w:val="false"/>
-                <w:b w:val="false"/>
-                <w:u w:val="none"/>
-                <w:strike w:val="false"/>
-                <w:sz w:val="14"/>
-                <w:szCs w:val="14"/>
-                <w:color w:val="000000"/>
-              </w:rPr>
-              <w:t xml:space="preserve">0.063</w:t>
+              <w:t xml:space="preserve">0.065</w:t>
             </w:r>
           </w:p>
         </w:tc>
@@ -7022,7 +7022,7 @@
                 <w:szCs w:val="14"/>
                 <w:color w:val="000000"/>
               </w:rPr>
-              <w:t xml:space="preserve">0.140</w:t>
+              <w:t xml:space="preserve">0.137</w:t>
             </w:r>
           </w:p>
         </w:tc>
@@ -7242,7 +7242,7 @@
                 <w:szCs w:val="14"/>
                 <w:color w:val="000000"/>
               </w:rPr>
-              <w:t xml:space="preserve">0.77 (0.50–1.17)</w:t>
+              <w:t xml:space="preserve">0.76 (0.49–1.17)</w:t>
             </w:r>
           </w:p>
         </w:tc>
@@ -7297,7 +7297,7 @@
                 <w:szCs w:val="14"/>
                 <w:color w:val="000000"/>
               </w:rPr>
-              <w:t xml:space="preserve">0.218</w:t>
+              <w:t xml:space="preserve">0.202</w:t>
             </w:r>
           </w:p>
         </w:tc>
@@ -7352,7 +7352,7 @@
                 <w:szCs w:val="14"/>
                 <w:color w:val="000000"/>
               </w:rPr>
-              <w:t xml:space="preserve">0.055</w:t>
+              <w:t xml:space="preserve">0.063</w:t>
             </w:r>
           </w:p>
         </w:tc>
@@ -7797,7 +7797,7 @@
                 <w:szCs w:val="14"/>
                 <w:color w:val="000000"/>
               </w:rPr>
-              <w:t xml:space="preserve">0.61 (0.34–1.11)</w:t>
+              <w:t xml:space="preserve">0.60 (0.34–1.09)</w:t>
             </w:r>
           </w:p>
         </w:tc>
@@ -7852,7 +7852,7 @@
                 <w:szCs w:val="14"/>
                 <w:color w:val="000000"/>
               </w:rPr>
-              <w:t xml:space="preserve">0.104</w:t>
+              <w:t xml:space="preserve">0.094</w:t>
             </w:r>
           </w:p>
         </w:tc>
@@ -8072,7 +8072,7 @@
                 <w:szCs w:val="14"/>
                 <w:color w:val="000000"/>
               </w:rPr>
-              <w:t xml:space="preserve">0.55 (0.35–0.85)</w:t>
+              <w:t xml:space="preserve">0.54 (0.34–0.84)</w:t>
             </w:r>
           </w:p>
         </w:tc>
@@ -8127,7 +8127,7 @@
                 <w:szCs w:val="14"/>
                 <w:color w:val="000000"/>
               </w:rPr>
-              <w:t xml:space="preserve">0.009</w:t>
+              <w:t xml:space="preserve">0.007</w:t>
             </w:r>
           </w:p>
         </w:tc>
@@ -8182,7 +8182,7 @@
                 <w:szCs w:val="14"/>
                 <w:color w:val="000000"/>
               </w:rPr>
-              <w:t xml:space="preserve">0.045</w:t>
+              <w:t xml:space="preserve">0.047</w:t>
             </w:r>
           </w:p>
         </w:tc>

</xml_diff>